<commit_message>
docs: cap nhat tai lieu do an va tong hop nghiep vu chi tiet
Co-authored-by: Cursor <cursoragent@cursor.com>
</commit_message>
<xml_diff>
--- a/Tài liệu.docx
+++ b/Tài liệu.docx
@@ -2047,10 +2047,1956 @@
         <w:t xml:space="preserve"> trực quan (tỷ lệ Pass/Fail, các lỗi phổ biến).</w:t>
       </w:r>
     </w:p>
-    <w:p>
-      <w:bookmarkStart w:id="0" w:name="_GoBack"/>
-      <w:bookmarkEnd w:id="0"/>
-    </w:p>
+    <w:tbl>
+      <w:tblPr>
+        <w:tblStyle w:val="TableGrid"/>
+        <w:tblW w:w="0" w:type="auto"/>
+        <w:tblLook w:val="04A0" w:firstRow="1" w:lastRow="0" w:firstColumn="1" w:lastColumn="0" w:noHBand="0" w:noVBand="1"/>
+      </w:tblPr>
+      <w:tblGrid>
+        <w:gridCol w:w="988"/>
+        <w:gridCol w:w="2409"/>
+        <w:gridCol w:w="5664"/>
+      </w:tblGrid>
+      <w:tr>
+        <w:tc>
+          <w:tcPr>
+            <w:tcW w:w="988" w:type="dxa"/>
+          </w:tcPr>
+          <w:p>
+            <w:pPr>
+              <w:spacing w:before="60" w:after="60"/>
+              <w:jc w:val="center"/>
+              <w:rPr>
+                <w:b/>
+                <w:bCs/>
+                <w:sz w:val="28"/>
+                <w:szCs w:val="28"/>
+              </w:rPr>
+            </w:pPr>
+            <w:r>
+              <w:rPr>
+                <w:b/>
+                <w:bCs/>
+                <w:sz w:val="28"/>
+                <w:szCs w:val="28"/>
+              </w:rPr>
+              <w:t>STT</w:t>
+            </w:r>
+          </w:p>
+        </w:tc>
+        <w:tc>
+          <w:tcPr>
+            <w:tcW w:w="2409" w:type="dxa"/>
+          </w:tcPr>
+          <w:p>
+            <w:pPr>
+              <w:spacing w:before="60" w:after="60"/>
+              <w:jc w:val="center"/>
+              <w:rPr>
+                <w:b/>
+                <w:bCs/>
+                <w:sz w:val="28"/>
+                <w:szCs w:val="28"/>
+              </w:rPr>
+            </w:pPr>
+            <w:r>
+              <w:rPr>
+                <w:b/>
+                <w:bCs/>
+                <w:sz w:val="28"/>
+                <w:szCs w:val="28"/>
+              </w:rPr>
+              <w:t>Tác nhân</w:t>
+            </w:r>
+          </w:p>
+        </w:tc>
+        <w:tc>
+          <w:tcPr>
+            <w:tcW w:w="5665" w:type="dxa"/>
+          </w:tcPr>
+          <w:p>
+            <w:pPr>
+              <w:spacing w:before="60" w:after="60"/>
+              <w:jc w:val="center"/>
+              <w:rPr>
+                <w:b/>
+                <w:bCs/>
+                <w:sz w:val="28"/>
+                <w:szCs w:val="28"/>
+              </w:rPr>
+            </w:pPr>
+            <w:r>
+              <w:rPr>
+                <w:b/>
+                <w:bCs/>
+                <w:sz w:val="28"/>
+                <w:szCs w:val="28"/>
+              </w:rPr>
+              <w:t>Chức năng dự kiến</w:t>
+            </w:r>
+          </w:p>
+        </w:tc>
+      </w:tr>
+      <w:tr>
+        <w:tc>
+          <w:tcPr>
+            <w:tcW w:w="988" w:type="dxa"/>
+          </w:tcPr>
+          <w:p>
+            <w:pPr>
+              <w:spacing w:before="60" w:after="60"/>
+              <w:jc w:val="center"/>
+              <w:rPr>
+                <w:sz w:val="28"/>
+                <w:szCs w:val="28"/>
+              </w:rPr>
+            </w:pPr>
+            <w:r>
+              <w:rPr>
+                <w:sz w:val="28"/>
+                <w:szCs w:val="28"/>
+              </w:rPr>
+              <w:t>1</w:t>
+            </w:r>
+          </w:p>
+        </w:tc>
+        <w:tc>
+          <w:tcPr>
+            <w:tcW w:w="2409" w:type="dxa"/>
+          </w:tcPr>
+          <w:p>
+            <w:pPr>
+              <w:spacing w:before="60" w:after="60"/>
+              <w:jc w:val="center"/>
+              <w:rPr>
+                <w:sz w:val="28"/>
+                <w:szCs w:val="28"/>
+              </w:rPr>
+            </w:pPr>
+            <w:r>
+              <w:rPr>
+                <w:sz w:val="28"/>
+                <w:szCs w:val="28"/>
+              </w:rPr>
+              <w:t xml:space="preserve">Quản </w:t>
+            </w:r>
+            <w:r>
+              <w:rPr>
+                <w:sz w:val="28"/>
+                <w:szCs w:val="28"/>
+              </w:rPr>
+              <w:t>trị viên</w:t>
+            </w:r>
+            <w:r>
+              <w:rPr>
+                <w:sz w:val="28"/>
+                <w:szCs w:val="28"/>
+              </w:rPr>
+              <w:t xml:space="preserve"> (Admin)</w:t>
+            </w:r>
+          </w:p>
+        </w:tc>
+        <w:tc>
+          <w:tcPr>
+            <w:tcW w:w="5665" w:type="dxa"/>
+          </w:tcPr>
+          <w:p>
+            <w:pPr>
+              <w:pStyle w:val="ListParagraph"/>
+              <w:numPr>
+                <w:ilvl w:val="0"/>
+                <w:numId w:val="10"/>
+              </w:numPr>
+              <w:spacing w:before="60" w:after="60"/>
+              <w:ind w:hanging="357"/>
+              <w:jc w:val="both"/>
+              <w:rPr>
+                <w:sz w:val="28"/>
+                <w:szCs w:val="28"/>
+                <w:lang w:val="vi-VN"/>
+              </w:rPr>
+            </w:pPr>
+            <w:r>
+              <w:rPr>
+                <w:sz w:val="28"/>
+                <w:szCs w:val="28"/>
+                <w:lang w:val="en-US"/>
+              </w:rPr>
+              <w:t>Xác thực &amp; tài khoản</w:t>
+            </w:r>
+          </w:p>
+          <w:p>
+            <w:pPr>
+              <w:pStyle w:val="ListParagraph"/>
+              <w:numPr>
+                <w:ilvl w:val="1"/>
+                <w:numId w:val="9"/>
+              </w:numPr>
+              <w:spacing w:before="60" w:after="60"/>
+              <w:ind w:hanging="357"/>
+              <w:jc w:val="both"/>
+              <w:rPr>
+                <w:sz w:val="28"/>
+                <w:szCs w:val="28"/>
+                <w:lang w:val="vi-VN"/>
+              </w:rPr>
+            </w:pPr>
+            <w:r>
+              <w:rPr>
+                <w:sz w:val="28"/>
+                <w:szCs w:val="28"/>
+                <w:lang w:val="en-US"/>
+              </w:rPr>
+              <w:t>Đăng ký tài khoản</w:t>
+            </w:r>
+          </w:p>
+          <w:p>
+            <w:pPr>
+              <w:pStyle w:val="ListParagraph"/>
+              <w:numPr>
+                <w:ilvl w:val="1"/>
+                <w:numId w:val="9"/>
+              </w:numPr>
+              <w:spacing w:before="60" w:after="60"/>
+              <w:ind w:hanging="357"/>
+              <w:jc w:val="both"/>
+              <w:rPr>
+                <w:sz w:val="28"/>
+                <w:szCs w:val="28"/>
+                <w:lang w:val="vi-VN"/>
+              </w:rPr>
+            </w:pPr>
+            <w:r>
+              <w:rPr>
+                <w:sz w:val="28"/>
+                <w:szCs w:val="28"/>
+                <w:lang w:val="en-US"/>
+              </w:rPr>
+              <w:t>Đăng nhập, đăng xuất</w:t>
+            </w:r>
+          </w:p>
+          <w:p>
+            <w:pPr>
+              <w:pStyle w:val="ListParagraph"/>
+              <w:numPr>
+                <w:ilvl w:val="1"/>
+                <w:numId w:val="9"/>
+              </w:numPr>
+              <w:spacing w:before="60" w:after="60"/>
+              <w:ind w:hanging="357"/>
+              <w:jc w:val="both"/>
+              <w:rPr>
+                <w:sz w:val="28"/>
+                <w:szCs w:val="28"/>
+                <w:lang w:val="vi-VN"/>
+              </w:rPr>
+            </w:pPr>
+            <w:r>
+              <w:rPr>
+                <w:sz w:val="28"/>
+                <w:szCs w:val="28"/>
+                <w:lang w:val="en-US"/>
+              </w:rPr>
+              <w:t>Xem hồ sơ</w:t>
+            </w:r>
+          </w:p>
+          <w:p>
+            <w:pPr>
+              <w:pStyle w:val="ListParagraph"/>
+              <w:numPr>
+                <w:ilvl w:val="1"/>
+                <w:numId w:val="9"/>
+              </w:numPr>
+              <w:spacing w:before="60" w:after="60"/>
+              <w:ind w:hanging="357"/>
+              <w:jc w:val="both"/>
+              <w:rPr>
+                <w:sz w:val="28"/>
+                <w:szCs w:val="28"/>
+                <w:lang w:val="vi-VN"/>
+              </w:rPr>
+            </w:pPr>
+            <w:r>
+              <w:rPr>
+                <w:sz w:val="28"/>
+                <w:szCs w:val="28"/>
+                <w:lang w:val="en-US"/>
+              </w:rPr>
+              <w:t>Đổi mật khẩu</w:t>
+            </w:r>
+          </w:p>
+          <w:p>
+            <w:pPr>
+              <w:pStyle w:val="ListParagraph"/>
+              <w:numPr>
+                <w:ilvl w:val="1"/>
+                <w:numId w:val="9"/>
+              </w:numPr>
+              <w:spacing w:before="60" w:after="60"/>
+              <w:ind w:hanging="357"/>
+              <w:jc w:val="both"/>
+              <w:rPr>
+                <w:sz w:val="28"/>
+                <w:szCs w:val="28"/>
+                <w:lang w:val="vi-VN"/>
+              </w:rPr>
+            </w:pPr>
+            <w:r>
+              <w:rPr>
+                <w:sz w:val="28"/>
+                <w:szCs w:val="28"/>
+                <w:lang w:val="vi-VN"/>
+              </w:rPr>
+              <w:t>Quên/ đặt lại mật kh</w:t>
+            </w:r>
+            <w:r>
+              <w:rPr>
+                <w:sz w:val="28"/>
+                <w:szCs w:val="28"/>
+                <w:lang w:val="vi-VN"/>
+              </w:rPr>
+              <w:t>ẩ</w:t>
+            </w:r>
+            <w:r>
+              <w:rPr>
+                <w:sz w:val="28"/>
+                <w:szCs w:val="28"/>
+                <w:lang w:val="vi-VN"/>
+              </w:rPr>
+              <w:t>u</w:t>
+            </w:r>
+          </w:p>
+          <w:p>
+            <w:pPr>
+              <w:pStyle w:val="ListParagraph"/>
+              <w:numPr>
+                <w:ilvl w:val="0"/>
+                <w:numId w:val="9"/>
+              </w:numPr>
+              <w:spacing w:before="60" w:after="60"/>
+              <w:jc w:val="both"/>
+              <w:rPr>
+                <w:sz w:val="28"/>
+                <w:szCs w:val="28"/>
+                <w:lang w:val="vi-VN"/>
+              </w:rPr>
+            </w:pPr>
+            <w:r>
+              <w:rPr>
+                <w:sz w:val="28"/>
+                <w:szCs w:val="28"/>
+                <w:lang w:val="vi-VN"/>
+              </w:rPr>
+              <w:t>Quản lý</w:t>
+            </w:r>
+            <w:r>
+              <w:rPr>
+                <w:sz w:val="28"/>
+                <w:szCs w:val="28"/>
+                <w:lang w:val="en-US"/>
+              </w:rPr>
+              <w:t xml:space="preserve"> dự án</w:t>
+            </w:r>
+          </w:p>
+          <w:p>
+            <w:pPr>
+              <w:pStyle w:val="ListParagraph"/>
+              <w:numPr>
+                <w:ilvl w:val="1"/>
+                <w:numId w:val="9"/>
+              </w:numPr>
+              <w:spacing w:before="60" w:after="60"/>
+              <w:ind w:hanging="357"/>
+              <w:jc w:val="both"/>
+              <w:rPr>
+                <w:sz w:val="28"/>
+                <w:szCs w:val="28"/>
+                <w:lang w:val="vi-VN"/>
+              </w:rPr>
+            </w:pPr>
+            <w:r>
+              <w:rPr>
+                <w:sz w:val="28"/>
+                <w:szCs w:val="28"/>
+                <w:lang w:val="vi-VN"/>
+              </w:rPr>
+              <w:t xml:space="preserve">Thêm </w:t>
+            </w:r>
+            <w:r>
+              <w:rPr>
+                <w:sz w:val="28"/>
+                <w:szCs w:val="28"/>
+                <w:lang w:val="en-US"/>
+              </w:rPr>
+              <w:t>dự án</w:t>
+            </w:r>
+          </w:p>
+          <w:p>
+            <w:pPr>
+              <w:pStyle w:val="ListParagraph"/>
+              <w:numPr>
+                <w:ilvl w:val="1"/>
+                <w:numId w:val="9"/>
+              </w:numPr>
+              <w:spacing w:before="60" w:after="60"/>
+              <w:ind w:hanging="357"/>
+              <w:jc w:val="both"/>
+              <w:rPr>
+                <w:sz w:val="28"/>
+                <w:szCs w:val="28"/>
+                <w:lang w:val="vi-VN"/>
+              </w:rPr>
+            </w:pPr>
+            <w:r>
+              <w:rPr>
+                <w:sz w:val="28"/>
+                <w:szCs w:val="28"/>
+                <w:lang w:val="vi-VN"/>
+              </w:rPr>
+              <w:t>Sửa thông tin</w:t>
+            </w:r>
+            <w:r>
+              <w:rPr>
+                <w:sz w:val="28"/>
+                <w:szCs w:val="28"/>
+                <w:lang w:val="en-US"/>
+              </w:rPr>
+              <w:t xml:space="preserve"> dự án</w:t>
+            </w:r>
+          </w:p>
+          <w:p>
+            <w:pPr>
+              <w:pStyle w:val="ListParagraph"/>
+              <w:numPr>
+                <w:ilvl w:val="1"/>
+                <w:numId w:val="9"/>
+              </w:numPr>
+              <w:spacing w:before="60" w:after="60"/>
+              <w:jc w:val="both"/>
+              <w:rPr>
+                <w:sz w:val="28"/>
+                <w:szCs w:val="28"/>
+                <w:lang w:val="vi-VN"/>
+              </w:rPr>
+            </w:pPr>
+            <w:r>
+              <w:rPr>
+                <w:sz w:val="28"/>
+                <w:szCs w:val="28"/>
+                <w:lang w:val="vi-VN"/>
+              </w:rPr>
+              <w:t xml:space="preserve">Xóa </w:t>
+            </w:r>
+            <w:r>
+              <w:rPr>
+                <w:sz w:val="28"/>
+                <w:szCs w:val="28"/>
+                <w:lang w:val="en-US"/>
+              </w:rPr>
+              <w:t>dự án</w:t>
+            </w:r>
+          </w:p>
+          <w:p>
+            <w:pPr>
+              <w:pStyle w:val="ListParagraph"/>
+              <w:numPr>
+                <w:ilvl w:val="1"/>
+                <w:numId w:val="9"/>
+              </w:numPr>
+              <w:spacing w:before="60" w:after="60"/>
+              <w:ind w:hanging="357"/>
+              <w:jc w:val="both"/>
+              <w:rPr>
+                <w:sz w:val="28"/>
+                <w:szCs w:val="28"/>
+                <w:lang w:val="vi-VN"/>
+              </w:rPr>
+            </w:pPr>
+            <w:r>
+              <w:rPr>
+                <w:rFonts w:eastAsiaTheme="minorEastAsia"/>
+                <w:sz w:val="28"/>
+                <w:szCs w:val="28"/>
+                <w:lang w:val="en-US"/>
+              </w:rPr>
+              <w:t>Tìm kiếm</w:t>
+            </w:r>
+          </w:p>
+          <w:p>
+            <w:pPr>
+              <w:pStyle w:val="ListParagraph"/>
+              <w:numPr>
+                <w:ilvl w:val="0"/>
+                <w:numId w:val="9"/>
+              </w:numPr>
+              <w:spacing w:before="60" w:after="60"/>
+              <w:jc w:val="both"/>
+              <w:rPr>
+                <w:sz w:val="28"/>
+                <w:szCs w:val="28"/>
+                <w:lang w:val="vi-VN"/>
+              </w:rPr>
+            </w:pPr>
+            <w:r>
+              <w:rPr>
+                <w:sz w:val="28"/>
+                <w:szCs w:val="28"/>
+                <w:lang w:val="en-US"/>
+              </w:rPr>
+              <w:t>Ghi thao tác</w:t>
+            </w:r>
+          </w:p>
+          <w:p>
+            <w:pPr>
+              <w:pStyle w:val="ListParagraph"/>
+              <w:numPr>
+                <w:ilvl w:val="1"/>
+                <w:numId w:val="9"/>
+              </w:numPr>
+              <w:spacing w:before="60" w:after="60"/>
+              <w:ind w:hanging="357"/>
+              <w:jc w:val="both"/>
+              <w:rPr>
+                <w:sz w:val="28"/>
+                <w:szCs w:val="28"/>
+                <w:lang w:val="vi-VN"/>
+              </w:rPr>
+            </w:pPr>
+            <w:r>
+              <w:rPr>
+                <w:sz w:val="28"/>
+                <w:szCs w:val="28"/>
+                <w:lang w:val="en-US"/>
+              </w:rPr>
+              <w:t>Thêm thao tác</w:t>
+            </w:r>
+          </w:p>
+          <w:p>
+            <w:pPr>
+              <w:pStyle w:val="ListParagraph"/>
+              <w:numPr>
+                <w:ilvl w:val="1"/>
+                <w:numId w:val="9"/>
+              </w:numPr>
+              <w:spacing w:before="60" w:after="60"/>
+              <w:ind w:hanging="357"/>
+              <w:jc w:val="both"/>
+              <w:rPr>
+                <w:sz w:val="28"/>
+                <w:szCs w:val="28"/>
+                <w:lang w:val="vi-VN"/>
+              </w:rPr>
+            </w:pPr>
+            <w:r>
+              <w:rPr>
+                <w:sz w:val="28"/>
+                <w:szCs w:val="28"/>
+                <w:lang w:val="en-US"/>
+              </w:rPr>
+              <w:t>Xóa thao tác</w:t>
+            </w:r>
+          </w:p>
+          <w:p>
+            <w:pPr>
+              <w:pStyle w:val="ListParagraph"/>
+              <w:numPr>
+                <w:ilvl w:val="1"/>
+                <w:numId w:val="9"/>
+              </w:numPr>
+              <w:spacing w:before="60" w:after="60"/>
+              <w:ind w:hanging="357"/>
+              <w:jc w:val="both"/>
+              <w:rPr>
+                <w:sz w:val="28"/>
+                <w:szCs w:val="28"/>
+                <w:lang w:val="vi-VN"/>
+              </w:rPr>
+            </w:pPr>
+            <w:r>
+              <w:rPr>
+                <w:sz w:val="28"/>
+                <w:szCs w:val="28"/>
+                <w:lang w:val="en-US"/>
+              </w:rPr>
+              <w:t>Gửi test nháp</w:t>
+            </w:r>
+          </w:p>
+          <w:p>
+            <w:pPr>
+              <w:pStyle w:val="ListParagraph"/>
+              <w:numPr>
+                <w:ilvl w:val="0"/>
+                <w:numId w:val="9"/>
+              </w:numPr>
+              <w:spacing w:before="60" w:after="60"/>
+              <w:jc w:val="both"/>
+              <w:rPr>
+                <w:sz w:val="28"/>
+                <w:szCs w:val="28"/>
+                <w:lang w:val="vi-VN"/>
+              </w:rPr>
+            </w:pPr>
+            <w:r>
+              <w:rPr>
+                <w:sz w:val="28"/>
+                <w:szCs w:val="28"/>
+                <w:lang w:val="en-US"/>
+              </w:rPr>
+              <w:t>Biên tập</w:t>
+            </w:r>
+          </w:p>
+          <w:p>
+            <w:pPr>
+              <w:pStyle w:val="ListParagraph"/>
+              <w:numPr>
+                <w:ilvl w:val="1"/>
+                <w:numId w:val="9"/>
+              </w:numPr>
+              <w:spacing w:before="60" w:after="60"/>
+              <w:ind w:hanging="357"/>
+              <w:jc w:val="both"/>
+              <w:rPr>
+                <w:sz w:val="28"/>
+                <w:szCs w:val="28"/>
+                <w:lang w:val="vi-VN"/>
+              </w:rPr>
+            </w:pPr>
+            <w:r>
+              <w:rPr>
+                <w:sz w:val="28"/>
+                <w:szCs w:val="28"/>
+                <w:lang w:val="en-US"/>
+              </w:rPr>
+              <w:t>Publish test</w:t>
+            </w:r>
+          </w:p>
+          <w:p>
+            <w:pPr>
+              <w:pStyle w:val="ListParagraph"/>
+              <w:numPr>
+                <w:ilvl w:val="0"/>
+                <w:numId w:val="9"/>
+              </w:numPr>
+              <w:spacing w:before="60" w:after="60"/>
+              <w:jc w:val="both"/>
+              <w:rPr>
+                <w:sz w:val="28"/>
+                <w:szCs w:val="28"/>
+                <w:lang w:val="vi-VN"/>
+              </w:rPr>
+            </w:pPr>
+            <w:r>
+              <w:rPr>
+                <w:sz w:val="28"/>
+                <w:szCs w:val="28"/>
+                <w:lang w:val="en-US"/>
+              </w:rPr>
+              <w:t>Kịch bản</w:t>
+            </w:r>
+          </w:p>
+          <w:p>
+            <w:pPr>
+              <w:pStyle w:val="ListParagraph"/>
+              <w:numPr>
+                <w:ilvl w:val="1"/>
+                <w:numId w:val="9"/>
+              </w:numPr>
+              <w:spacing w:before="60" w:after="60"/>
+              <w:ind w:hanging="357"/>
+              <w:jc w:val="both"/>
+              <w:rPr>
+                <w:sz w:val="28"/>
+                <w:szCs w:val="28"/>
+                <w:lang w:val="vi-VN"/>
+              </w:rPr>
+            </w:pPr>
+            <w:r>
+              <w:rPr>
+                <w:sz w:val="28"/>
+                <w:szCs w:val="28"/>
+                <w:lang w:val="vi-VN"/>
+              </w:rPr>
+              <w:t xml:space="preserve">Thêm </w:t>
+            </w:r>
+            <w:r>
+              <w:rPr>
+                <w:sz w:val="28"/>
+                <w:szCs w:val="28"/>
+                <w:lang w:val="en-US"/>
+              </w:rPr>
+              <w:t>kịch bản</w:t>
+            </w:r>
+          </w:p>
+          <w:p>
+            <w:pPr>
+              <w:pStyle w:val="ListParagraph"/>
+              <w:numPr>
+                <w:ilvl w:val="1"/>
+                <w:numId w:val="9"/>
+              </w:numPr>
+              <w:spacing w:before="60" w:after="60"/>
+              <w:ind w:hanging="357"/>
+              <w:jc w:val="both"/>
+              <w:rPr>
+                <w:sz w:val="28"/>
+                <w:szCs w:val="28"/>
+                <w:lang w:val="vi-VN"/>
+              </w:rPr>
+            </w:pPr>
+            <w:r>
+              <w:rPr>
+                <w:sz w:val="28"/>
+                <w:szCs w:val="28"/>
+                <w:lang w:val="vi-VN"/>
+              </w:rPr>
+              <w:t xml:space="preserve">Sửa </w:t>
+            </w:r>
+            <w:r>
+              <w:rPr>
+                <w:sz w:val="28"/>
+                <w:szCs w:val="28"/>
+                <w:lang w:val="en-US"/>
+              </w:rPr>
+              <w:t>kịch bản</w:t>
+            </w:r>
+          </w:p>
+          <w:p>
+            <w:pPr>
+              <w:pStyle w:val="ListParagraph"/>
+              <w:numPr>
+                <w:ilvl w:val="1"/>
+                <w:numId w:val="9"/>
+              </w:numPr>
+              <w:spacing w:before="60" w:after="60"/>
+              <w:jc w:val="both"/>
+              <w:rPr>
+                <w:sz w:val="28"/>
+                <w:szCs w:val="28"/>
+                <w:lang w:val="vi-VN"/>
+              </w:rPr>
+            </w:pPr>
+            <w:r>
+              <w:rPr>
+                <w:sz w:val="28"/>
+                <w:szCs w:val="28"/>
+                <w:lang w:val="vi-VN"/>
+              </w:rPr>
+              <w:t xml:space="preserve">Xóa </w:t>
+            </w:r>
+            <w:r>
+              <w:rPr>
+                <w:sz w:val="28"/>
+                <w:szCs w:val="28"/>
+                <w:lang w:val="en-US"/>
+              </w:rPr>
+              <w:t>kịch bản</w:t>
+            </w:r>
+          </w:p>
+          <w:p>
+            <w:pPr>
+              <w:pStyle w:val="ListParagraph"/>
+              <w:numPr>
+                <w:ilvl w:val="1"/>
+                <w:numId w:val="9"/>
+              </w:numPr>
+              <w:spacing w:before="60" w:after="60"/>
+              <w:ind w:hanging="357"/>
+              <w:jc w:val="both"/>
+              <w:rPr>
+                <w:sz w:val="28"/>
+                <w:szCs w:val="28"/>
+                <w:lang w:val="vi-VN"/>
+              </w:rPr>
+            </w:pPr>
+            <w:r>
+              <w:rPr>
+                <w:rFonts w:eastAsiaTheme="minorEastAsia"/>
+                <w:sz w:val="28"/>
+                <w:szCs w:val="28"/>
+                <w:lang w:val="en-US"/>
+              </w:rPr>
+              <w:t>Tìm kiếm</w:t>
+            </w:r>
+          </w:p>
+          <w:p>
+            <w:pPr>
+              <w:pStyle w:val="ListParagraph"/>
+              <w:numPr>
+                <w:ilvl w:val="0"/>
+                <w:numId w:val="9"/>
+              </w:numPr>
+              <w:spacing w:before="60" w:after="60"/>
+              <w:jc w:val="both"/>
+              <w:rPr>
+                <w:sz w:val="28"/>
+                <w:szCs w:val="28"/>
+                <w:lang w:val="vi-VN"/>
+              </w:rPr>
+            </w:pPr>
+            <w:r>
+              <w:rPr>
+                <w:sz w:val="28"/>
+                <w:szCs w:val="28"/>
+                <w:lang w:val="en-US"/>
+              </w:rPr>
+              <w:t>Đối tượng UI</w:t>
+            </w:r>
+          </w:p>
+          <w:p>
+            <w:pPr>
+              <w:pStyle w:val="ListParagraph"/>
+              <w:numPr>
+                <w:ilvl w:val="1"/>
+                <w:numId w:val="9"/>
+              </w:numPr>
+              <w:spacing w:before="60" w:after="60"/>
+              <w:ind w:hanging="357"/>
+              <w:jc w:val="both"/>
+              <w:rPr>
+                <w:sz w:val="28"/>
+                <w:szCs w:val="28"/>
+                <w:lang w:val="vi-VN"/>
+              </w:rPr>
+            </w:pPr>
+            <w:r>
+              <w:rPr>
+                <w:sz w:val="28"/>
+                <w:szCs w:val="28"/>
+                <w:lang w:val="vi-VN"/>
+              </w:rPr>
+              <w:t xml:space="preserve">Thêm </w:t>
+            </w:r>
+            <w:r>
+              <w:rPr>
+                <w:sz w:val="28"/>
+                <w:szCs w:val="28"/>
+                <w:lang w:val="en-US"/>
+              </w:rPr>
+              <w:t>đối tượng</w:t>
+            </w:r>
+          </w:p>
+          <w:p>
+            <w:pPr>
+              <w:pStyle w:val="ListParagraph"/>
+              <w:numPr>
+                <w:ilvl w:val="1"/>
+                <w:numId w:val="9"/>
+              </w:numPr>
+              <w:spacing w:before="60" w:after="60"/>
+              <w:jc w:val="both"/>
+              <w:rPr>
+                <w:sz w:val="28"/>
+                <w:szCs w:val="28"/>
+                <w:lang w:val="vi-VN"/>
+              </w:rPr>
+            </w:pPr>
+            <w:r>
+              <w:rPr>
+                <w:sz w:val="28"/>
+                <w:szCs w:val="28"/>
+                <w:lang w:val="vi-VN"/>
+              </w:rPr>
+              <w:t xml:space="preserve">Xóa </w:t>
+            </w:r>
+            <w:r>
+              <w:rPr>
+                <w:sz w:val="28"/>
+                <w:szCs w:val="28"/>
+                <w:lang w:val="en-US"/>
+              </w:rPr>
+              <w:t>đối tượng</w:t>
+            </w:r>
+          </w:p>
+          <w:p>
+            <w:pPr>
+              <w:pStyle w:val="ListParagraph"/>
+              <w:numPr>
+                <w:ilvl w:val="0"/>
+                <w:numId w:val="10"/>
+              </w:numPr>
+              <w:spacing w:before="60" w:after="60"/>
+              <w:ind w:hanging="357"/>
+              <w:jc w:val="both"/>
+              <w:rPr>
+                <w:sz w:val="28"/>
+                <w:szCs w:val="28"/>
+                <w:lang w:val="vi-VN"/>
+              </w:rPr>
+            </w:pPr>
+            <w:r>
+              <w:rPr>
+                <w:sz w:val="28"/>
+                <w:szCs w:val="28"/>
+                <w:lang w:val="en-US"/>
+              </w:rPr>
+              <w:t>Bộ dữ liệu</w:t>
+            </w:r>
+          </w:p>
+          <w:p>
+            <w:pPr>
+              <w:pStyle w:val="ListParagraph"/>
+              <w:numPr>
+                <w:ilvl w:val="1"/>
+                <w:numId w:val="9"/>
+              </w:numPr>
+              <w:spacing w:before="60" w:after="60"/>
+              <w:jc w:val="both"/>
+              <w:rPr>
+                <w:sz w:val="28"/>
+                <w:szCs w:val="28"/>
+                <w:lang w:val="vi-VN"/>
+              </w:rPr>
+            </w:pPr>
+            <w:r>
+              <w:rPr>
+                <w:sz w:val="28"/>
+                <w:szCs w:val="28"/>
+                <w:lang w:val="en-US"/>
+              </w:rPr>
+              <w:lastRenderedPageBreak/>
+              <w:t>Tạo bộ dữ liệu</w:t>
+            </w:r>
+          </w:p>
+          <w:p>
+            <w:pPr>
+              <w:pStyle w:val="ListParagraph"/>
+              <w:numPr>
+                <w:ilvl w:val="1"/>
+                <w:numId w:val="9"/>
+              </w:numPr>
+              <w:spacing w:before="60" w:after="60"/>
+              <w:jc w:val="both"/>
+              <w:rPr>
+                <w:sz w:val="28"/>
+                <w:szCs w:val="28"/>
+                <w:lang w:val="vi-VN"/>
+              </w:rPr>
+            </w:pPr>
+            <w:r>
+              <w:rPr>
+                <w:sz w:val="28"/>
+                <w:szCs w:val="28"/>
+                <w:lang w:val="en-US"/>
+              </w:rPr>
+              <w:t>Xóa bộ dữ liệu</w:t>
+            </w:r>
+          </w:p>
+          <w:p>
+            <w:pPr>
+              <w:pStyle w:val="ListParagraph"/>
+              <w:numPr>
+                <w:ilvl w:val="0"/>
+                <w:numId w:val="10"/>
+              </w:numPr>
+              <w:spacing w:before="60" w:after="60"/>
+              <w:ind w:hanging="357"/>
+              <w:jc w:val="both"/>
+              <w:rPr>
+                <w:sz w:val="28"/>
+                <w:szCs w:val="28"/>
+                <w:lang w:val="vi-VN"/>
+              </w:rPr>
+            </w:pPr>
+            <w:r>
+              <w:rPr>
+                <w:sz w:val="28"/>
+                <w:szCs w:val="28"/>
+                <w:lang w:val="en-US"/>
+              </w:rPr>
+              <w:t>Báo cáo</w:t>
+            </w:r>
+          </w:p>
+          <w:p>
+            <w:pPr>
+              <w:pStyle w:val="ListParagraph"/>
+              <w:numPr>
+                <w:ilvl w:val="1"/>
+                <w:numId w:val="9"/>
+              </w:numPr>
+              <w:spacing w:before="60" w:after="60"/>
+              <w:jc w:val="both"/>
+              <w:rPr>
+                <w:sz w:val="28"/>
+                <w:szCs w:val="28"/>
+                <w:lang w:val="vi-VN"/>
+              </w:rPr>
+            </w:pPr>
+            <w:r>
+              <w:rPr>
+                <w:sz w:val="28"/>
+                <w:szCs w:val="28"/>
+                <w:lang w:val="en-US"/>
+              </w:rPr>
+              <w:t>Tìm kiếm</w:t>
+            </w:r>
+          </w:p>
+          <w:p>
+            <w:pPr>
+              <w:pStyle w:val="ListParagraph"/>
+              <w:numPr>
+                <w:ilvl w:val="1"/>
+                <w:numId w:val="9"/>
+              </w:numPr>
+              <w:spacing w:before="60" w:after="60"/>
+              <w:jc w:val="both"/>
+              <w:rPr>
+                <w:sz w:val="28"/>
+                <w:szCs w:val="28"/>
+                <w:lang w:val="vi-VN"/>
+              </w:rPr>
+            </w:pPr>
+            <w:r>
+              <w:rPr>
+                <w:sz w:val="28"/>
+                <w:szCs w:val="28"/>
+                <w:lang w:val="en-US"/>
+              </w:rPr>
+              <w:t>Tải PDF</w:t>
+            </w:r>
+          </w:p>
+          <w:p>
+            <w:pPr>
+              <w:pStyle w:val="ListParagraph"/>
+              <w:numPr>
+                <w:ilvl w:val="1"/>
+                <w:numId w:val="9"/>
+              </w:numPr>
+              <w:spacing w:before="60" w:after="60"/>
+              <w:jc w:val="both"/>
+              <w:rPr>
+                <w:sz w:val="28"/>
+                <w:szCs w:val="28"/>
+                <w:lang w:val="vi-VN"/>
+              </w:rPr>
+            </w:pPr>
+            <w:r>
+              <w:rPr>
+                <w:sz w:val="28"/>
+                <w:szCs w:val="28"/>
+                <w:lang w:val="en-US"/>
+              </w:rPr>
+              <w:t>Chi tiết</w:t>
+            </w:r>
+          </w:p>
+          <w:p>
+            <w:pPr>
+              <w:pStyle w:val="ListParagraph"/>
+              <w:numPr>
+                <w:ilvl w:val="0"/>
+                <w:numId w:val="10"/>
+              </w:numPr>
+              <w:spacing w:before="60" w:after="60"/>
+              <w:ind w:hanging="357"/>
+              <w:jc w:val="both"/>
+              <w:rPr>
+                <w:sz w:val="28"/>
+                <w:szCs w:val="28"/>
+                <w:lang w:val="vi-VN"/>
+              </w:rPr>
+            </w:pPr>
+            <w:r>
+              <w:rPr>
+                <w:sz w:val="28"/>
+                <w:szCs w:val="28"/>
+                <w:lang w:val="en-US"/>
+              </w:rPr>
+              <w:t>Tài khoản</w:t>
+            </w:r>
+          </w:p>
+          <w:p>
+            <w:pPr>
+              <w:pStyle w:val="ListParagraph"/>
+              <w:numPr>
+                <w:ilvl w:val="1"/>
+                <w:numId w:val="9"/>
+              </w:numPr>
+              <w:spacing w:before="60" w:after="60"/>
+              <w:jc w:val="both"/>
+              <w:rPr>
+                <w:sz w:val="28"/>
+                <w:szCs w:val="28"/>
+                <w:lang w:val="vi-VN"/>
+              </w:rPr>
+            </w:pPr>
+            <w:r>
+              <w:rPr>
+                <w:sz w:val="28"/>
+                <w:szCs w:val="28"/>
+                <w:lang w:val="en-US"/>
+              </w:rPr>
+              <w:t>Đổi mật khẩu</w:t>
+            </w:r>
+          </w:p>
+          <w:p>
+            <w:pPr>
+              <w:pStyle w:val="ListParagraph"/>
+              <w:numPr>
+                <w:ilvl w:val="0"/>
+                <w:numId w:val="10"/>
+              </w:numPr>
+              <w:spacing w:before="60" w:after="60"/>
+              <w:ind w:hanging="357"/>
+              <w:jc w:val="both"/>
+              <w:rPr>
+                <w:sz w:val="28"/>
+                <w:szCs w:val="28"/>
+                <w:lang w:val="vi-VN"/>
+              </w:rPr>
+            </w:pPr>
+            <w:r>
+              <w:rPr>
+                <w:rFonts w:eastAsiaTheme="minorEastAsia"/>
+                <w:sz w:val="28"/>
+                <w:szCs w:val="28"/>
+                <w:lang w:val="vi-VN"/>
+              </w:rPr>
+              <w:t>Quản lý người dùng:</w:t>
+            </w:r>
+          </w:p>
+          <w:p>
+            <w:pPr>
+              <w:pStyle w:val="ListParagraph"/>
+              <w:numPr>
+                <w:ilvl w:val="1"/>
+                <w:numId w:val="9"/>
+              </w:numPr>
+              <w:spacing w:before="60" w:after="60"/>
+              <w:ind w:hanging="357"/>
+              <w:jc w:val="both"/>
+              <w:rPr>
+                <w:sz w:val="28"/>
+                <w:szCs w:val="28"/>
+                <w:lang w:val="vi-VN"/>
+              </w:rPr>
+            </w:pPr>
+            <w:r>
+              <w:rPr>
+                <w:sz w:val="28"/>
+                <w:szCs w:val="28"/>
+                <w:lang w:val="vi-VN"/>
+              </w:rPr>
+              <w:t xml:space="preserve">Thêm </w:t>
+            </w:r>
+            <w:r>
+              <w:rPr>
+                <w:rFonts w:eastAsiaTheme="minorEastAsia"/>
+                <w:sz w:val="28"/>
+                <w:szCs w:val="28"/>
+                <w:lang w:val="vi-VN"/>
+              </w:rPr>
+              <w:t>người dùng</w:t>
+            </w:r>
+          </w:p>
+          <w:p>
+            <w:pPr>
+              <w:pStyle w:val="ListParagraph"/>
+              <w:numPr>
+                <w:ilvl w:val="1"/>
+                <w:numId w:val="9"/>
+              </w:numPr>
+              <w:spacing w:before="60" w:after="60"/>
+              <w:ind w:hanging="357"/>
+              <w:jc w:val="both"/>
+              <w:rPr>
+                <w:sz w:val="28"/>
+                <w:szCs w:val="28"/>
+                <w:lang w:val="vi-VN"/>
+              </w:rPr>
+            </w:pPr>
+            <w:r>
+              <w:rPr>
+                <w:sz w:val="28"/>
+                <w:szCs w:val="28"/>
+                <w:lang w:val="vi-VN"/>
+              </w:rPr>
+              <w:t xml:space="preserve">Sửa thông tin </w:t>
+            </w:r>
+            <w:r>
+              <w:rPr>
+                <w:rFonts w:eastAsiaTheme="minorEastAsia"/>
+                <w:sz w:val="28"/>
+                <w:szCs w:val="28"/>
+                <w:lang w:val="vi-VN"/>
+              </w:rPr>
+              <w:t>người dùng</w:t>
+            </w:r>
+          </w:p>
+          <w:p>
+            <w:pPr>
+              <w:pStyle w:val="ListParagraph"/>
+              <w:numPr>
+                <w:ilvl w:val="1"/>
+                <w:numId w:val="9"/>
+              </w:numPr>
+              <w:spacing w:before="60" w:after="60"/>
+              <w:ind w:hanging="357"/>
+              <w:jc w:val="both"/>
+              <w:rPr>
+                <w:sz w:val="28"/>
+                <w:szCs w:val="28"/>
+                <w:lang w:val="vi-VN"/>
+              </w:rPr>
+            </w:pPr>
+            <w:r>
+              <w:rPr>
+                <w:sz w:val="28"/>
+                <w:szCs w:val="28"/>
+                <w:lang w:val="vi-VN"/>
+              </w:rPr>
+              <w:t xml:space="preserve">Xóa </w:t>
+            </w:r>
+            <w:r>
+              <w:rPr>
+                <w:rFonts w:eastAsiaTheme="minorEastAsia"/>
+                <w:sz w:val="28"/>
+                <w:szCs w:val="28"/>
+                <w:lang w:val="vi-VN"/>
+              </w:rPr>
+              <w:t>người dùng</w:t>
+            </w:r>
+          </w:p>
+          <w:p>
+            <w:pPr>
+              <w:pStyle w:val="ListParagraph"/>
+              <w:numPr>
+                <w:ilvl w:val="1"/>
+                <w:numId w:val="9"/>
+              </w:numPr>
+              <w:spacing w:before="60" w:after="60"/>
+              <w:ind w:hanging="357"/>
+              <w:jc w:val="both"/>
+              <w:rPr>
+                <w:sz w:val="28"/>
+                <w:szCs w:val="28"/>
+                <w:lang w:val="vi-VN"/>
+              </w:rPr>
+            </w:pPr>
+            <w:r>
+              <w:rPr>
+                <w:rFonts w:eastAsiaTheme="minorEastAsia"/>
+                <w:sz w:val="28"/>
+                <w:szCs w:val="28"/>
+                <w:lang w:val="en-US"/>
+              </w:rPr>
+              <w:t>Tìm kiếm</w:t>
+            </w:r>
+          </w:p>
+        </w:tc>
+      </w:tr>
+      <w:tr>
+        <w:tc>
+          <w:tcPr>
+            <w:tcW w:w="988" w:type="dxa"/>
+          </w:tcPr>
+          <w:p>
+            <w:pPr>
+              <w:spacing w:before="60" w:after="60"/>
+              <w:jc w:val="center"/>
+              <w:rPr>
+                <w:sz w:val="28"/>
+                <w:szCs w:val="28"/>
+              </w:rPr>
+            </w:pPr>
+            <w:r>
+              <w:rPr>
+                <w:sz w:val="28"/>
+                <w:szCs w:val="28"/>
+              </w:rPr>
+              <w:lastRenderedPageBreak/>
+              <w:t>2</w:t>
+            </w:r>
+          </w:p>
+        </w:tc>
+        <w:tc>
+          <w:tcPr>
+            <w:tcW w:w="2409" w:type="dxa"/>
+          </w:tcPr>
+          <w:p>
+            <w:pPr>
+              <w:spacing w:before="60" w:after="60"/>
+              <w:jc w:val="center"/>
+              <w:rPr>
+                <w:sz w:val="28"/>
+                <w:szCs w:val="28"/>
+              </w:rPr>
+            </w:pPr>
+            <w:r>
+              <w:rPr>
+                <w:sz w:val="28"/>
+                <w:szCs w:val="28"/>
+              </w:rPr>
+              <w:t>Kiềm thử viên</w:t>
+            </w:r>
+            <w:r>
+              <w:rPr>
+                <w:sz w:val="28"/>
+                <w:szCs w:val="28"/>
+              </w:rPr>
+              <w:t xml:space="preserve"> (</w:t>
+            </w:r>
+            <w:r>
+              <w:rPr>
+                <w:sz w:val="28"/>
+                <w:szCs w:val="28"/>
+              </w:rPr>
+              <w:t>Tester</w:t>
+            </w:r>
+            <w:r>
+              <w:rPr>
+                <w:sz w:val="28"/>
+                <w:szCs w:val="28"/>
+              </w:rPr>
+              <w:t>)</w:t>
+            </w:r>
+          </w:p>
+        </w:tc>
+        <w:tc>
+          <w:tcPr>
+            <w:tcW w:w="5665" w:type="dxa"/>
+          </w:tcPr>
+          <w:p>
+            <w:pPr>
+              <w:pStyle w:val="ListParagraph"/>
+              <w:numPr>
+                <w:ilvl w:val="0"/>
+                <w:numId w:val="11"/>
+              </w:numPr>
+              <w:spacing w:before="60" w:after="60"/>
+              <w:jc w:val="both"/>
+              <w:rPr>
+                <w:sz w:val="28"/>
+                <w:szCs w:val="28"/>
+                <w:lang w:val="vi-VN"/>
+              </w:rPr>
+            </w:pPr>
+            <w:r>
+              <w:rPr>
+                <w:sz w:val="28"/>
+                <w:szCs w:val="28"/>
+                <w:lang w:val="vi-VN"/>
+              </w:rPr>
+              <w:t>Đăng nhập, đăng xuất</w:t>
+            </w:r>
+          </w:p>
+          <w:p>
+            <w:pPr>
+              <w:pStyle w:val="ListParagraph"/>
+              <w:numPr>
+                <w:ilvl w:val="0"/>
+                <w:numId w:val="9"/>
+              </w:numPr>
+              <w:spacing w:before="60" w:after="60"/>
+              <w:jc w:val="both"/>
+              <w:rPr>
+                <w:sz w:val="28"/>
+                <w:szCs w:val="28"/>
+                <w:lang w:val="vi-VN"/>
+              </w:rPr>
+            </w:pPr>
+            <w:r>
+              <w:rPr>
+                <w:sz w:val="28"/>
+                <w:szCs w:val="28"/>
+                <w:lang w:val="en-US"/>
+              </w:rPr>
+              <w:t>Ghi thao tác</w:t>
+            </w:r>
+          </w:p>
+          <w:p>
+            <w:pPr>
+              <w:pStyle w:val="ListParagraph"/>
+              <w:numPr>
+                <w:ilvl w:val="1"/>
+                <w:numId w:val="9"/>
+              </w:numPr>
+              <w:spacing w:before="60" w:after="60"/>
+              <w:ind w:hanging="357"/>
+              <w:jc w:val="both"/>
+              <w:rPr>
+                <w:sz w:val="28"/>
+                <w:szCs w:val="28"/>
+                <w:lang w:val="vi-VN"/>
+              </w:rPr>
+            </w:pPr>
+            <w:r>
+              <w:rPr>
+                <w:sz w:val="28"/>
+                <w:szCs w:val="28"/>
+                <w:lang w:val="en-US"/>
+              </w:rPr>
+              <w:t>Thêm thao</w:t>
+            </w:r>
+            <w:bookmarkStart w:id="0" w:name="_GoBack"/>
+            <w:bookmarkEnd w:id="0"/>
+            <w:r>
+              <w:rPr>
+                <w:sz w:val="28"/>
+                <w:szCs w:val="28"/>
+                <w:lang w:val="en-US"/>
+              </w:rPr>
+              <w:t xml:space="preserve"> tác</w:t>
+            </w:r>
+          </w:p>
+          <w:p>
+            <w:pPr>
+              <w:pStyle w:val="ListParagraph"/>
+              <w:numPr>
+                <w:ilvl w:val="1"/>
+                <w:numId w:val="9"/>
+              </w:numPr>
+              <w:spacing w:before="60" w:after="60"/>
+              <w:ind w:hanging="357"/>
+              <w:jc w:val="both"/>
+              <w:rPr>
+                <w:sz w:val="28"/>
+                <w:szCs w:val="28"/>
+                <w:lang w:val="vi-VN"/>
+              </w:rPr>
+            </w:pPr>
+            <w:r>
+              <w:rPr>
+                <w:sz w:val="28"/>
+                <w:szCs w:val="28"/>
+                <w:lang w:val="en-US"/>
+              </w:rPr>
+              <w:t>Xóa thao tác</w:t>
+            </w:r>
+          </w:p>
+          <w:p>
+            <w:pPr>
+              <w:pStyle w:val="ListParagraph"/>
+              <w:numPr>
+                <w:ilvl w:val="1"/>
+                <w:numId w:val="9"/>
+              </w:numPr>
+              <w:spacing w:before="60" w:after="60"/>
+              <w:ind w:hanging="357"/>
+              <w:jc w:val="both"/>
+              <w:rPr>
+                <w:sz w:val="28"/>
+                <w:szCs w:val="28"/>
+                <w:lang w:val="vi-VN"/>
+              </w:rPr>
+            </w:pPr>
+            <w:r>
+              <w:rPr>
+                <w:sz w:val="28"/>
+                <w:szCs w:val="28"/>
+                <w:lang w:val="en-US"/>
+              </w:rPr>
+              <w:t>Gửi test nháp</w:t>
+            </w:r>
+          </w:p>
+          <w:p>
+            <w:pPr>
+              <w:pStyle w:val="ListParagraph"/>
+              <w:numPr>
+                <w:ilvl w:val="0"/>
+                <w:numId w:val="9"/>
+              </w:numPr>
+              <w:spacing w:before="60" w:after="60"/>
+              <w:jc w:val="both"/>
+              <w:rPr>
+                <w:sz w:val="28"/>
+                <w:szCs w:val="28"/>
+                <w:lang w:val="vi-VN"/>
+              </w:rPr>
+            </w:pPr>
+            <w:r>
+              <w:rPr>
+                <w:sz w:val="28"/>
+                <w:szCs w:val="28"/>
+                <w:lang w:val="en-US"/>
+              </w:rPr>
+              <w:t>Biên tập</w:t>
+            </w:r>
+          </w:p>
+          <w:p>
+            <w:pPr>
+              <w:pStyle w:val="ListParagraph"/>
+              <w:numPr>
+                <w:ilvl w:val="1"/>
+                <w:numId w:val="9"/>
+              </w:numPr>
+              <w:spacing w:before="60" w:after="60"/>
+              <w:ind w:hanging="357"/>
+              <w:jc w:val="both"/>
+              <w:rPr>
+                <w:sz w:val="28"/>
+                <w:szCs w:val="28"/>
+                <w:lang w:val="vi-VN"/>
+              </w:rPr>
+            </w:pPr>
+            <w:r>
+              <w:rPr>
+                <w:sz w:val="28"/>
+                <w:szCs w:val="28"/>
+                <w:lang w:val="en-US"/>
+              </w:rPr>
+              <w:t>Publish test</w:t>
+            </w:r>
+          </w:p>
+          <w:p>
+            <w:pPr>
+              <w:pStyle w:val="ListParagraph"/>
+              <w:numPr>
+                <w:ilvl w:val="0"/>
+                <w:numId w:val="9"/>
+              </w:numPr>
+              <w:spacing w:before="60" w:after="60"/>
+              <w:jc w:val="both"/>
+              <w:rPr>
+                <w:sz w:val="28"/>
+                <w:szCs w:val="28"/>
+                <w:lang w:val="vi-VN"/>
+              </w:rPr>
+            </w:pPr>
+            <w:r>
+              <w:rPr>
+                <w:sz w:val="28"/>
+                <w:szCs w:val="28"/>
+                <w:lang w:val="en-US"/>
+              </w:rPr>
+              <w:t>Kịch bản</w:t>
+            </w:r>
+          </w:p>
+          <w:p>
+            <w:pPr>
+              <w:pStyle w:val="ListParagraph"/>
+              <w:numPr>
+                <w:ilvl w:val="1"/>
+                <w:numId w:val="9"/>
+              </w:numPr>
+              <w:spacing w:before="60" w:after="60"/>
+              <w:ind w:hanging="357"/>
+              <w:jc w:val="both"/>
+              <w:rPr>
+                <w:sz w:val="28"/>
+                <w:szCs w:val="28"/>
+                <w:lang w:val="vi-VN"/>
+              </w:rPr>
+            </w:pPr>
+            <w:r>
+              <w:rPr>
+                <w:sz w:val="28"/>
+                <w:szCs w:val="28"/>
+                <w:lang w:val="vi-VN"/>
+              </w:rPr>
+              <w:t xml:space="preserve">Thêm </w:t>
+            </w:r>
+            <w:r>
+              <w:rPr>
+                <w:sz w:val="28"/>
+                <w:szCs w:val="28"/>
+                <w:lang w:val="en-US"/>
+              </w:rPr>
+              <w:t>kịch bản</w:t>
+            </w:r>
+          </w:p>
+          <w:p>
+            <w:pPr>
+              <w:pStyle w:val="ListParagraph"/>
+              <w:numPr>
+                <w:ilvl w:val="1"/>
+                <w:numId w:val="9"/>
+              </w:numPr>
+              <w:spacing w:before="60" w:after="60"/>
+              <w:ind w:hanging="357"/>
+              <w:jc w:val="both"/>
+              <w:rPr>
+                <w:sz w:val="28"/>
+                <w:szCs w:val="28"/>
+                <w:lang w:val="vi-VN"/>
+              </w:rPr>
+            </w:pPr>
+            <w:r>
+              <w:rPr>
+                <w:sz w:val="28"/>
+                <w:szCs w:val="28"/>
+                <w:lang w:val="vi-VN"/>
+              </w:rPr>
+              <w:t xml:space="preserve">Sửa </w:t>
+            </w:r>
+            <w:r>
+              <w:rPr>
+                <w:sz w:val="28"/>
+                <w:szCs w:val="28"/>
+                <w:lang w:val="en-US"/>
+              </w:rPr>
+              <w:t>kịch bản</w:t>
+            </w:r>
+          </w:p>
+          <w:p>
+            <w:pPr>
+              <w:pStyle w:val="ListParagraph"/>
+              <w:numPr>
+                <w:ilvl w:val="1"/>
+                <w:numId w:val="9"/>
+              </w:numPr>
+              <w:spacing w:before="60" w:after="60"/>
+              <w:jc w:val="both"/>
+              <w:rPr>
+                <w:sz w:val="28"/>
+                <w:szCs w:val="28"/>
+                <w:lang w:val="vi-VN"/>
+              </w:rPr>
+            </w:pPr>
+            <w:r>
+              <w:rPr>
+                <w:sz w:val="28"/>
+                <w:szCs w:val="28"/>
+                <w:lang w:val="vi-VN"/>
+              </w:rPr>
+              <w:t xml:space="preserve">Xóa </w:t>
+            </w:r>
+            <w:r>
+              <w:rPr>
+                <w:sz w:val="28"/>
+                <w:szCs w:val="28"/>
+                <w:lang w:val="en-US"/>
+              </w:rPr>
+              <w:t>kịch bản</w:t>
+            </w:r>
+          </w:p>
+          <w:p>
+            <w:pPr>
+              <w:pStyle w:val="ListParagraph"/>
+              <w:numPr>
+                <w:ilvl w:val="1"/>
+                <w:numId w:val="9"/>
+              </w:numPr>
+              <w:spacing w:before="60" w:after="60"/>
+              <w:ind w:hanging="357"/>
+              <w:jc w:val="both"/>
+              <w:rPr>
+                <w:sz w:val="28"/>
+                <w:szCs w:val="28"/>
+                <w:lang w:val="vi-VN"/>
+              </w:rPr>
+            </w:pPr>
+            <w:r>
+              <w:rPr>
+                <w:rFonts w:eastAsiaTheme="minorEastAsia"/>
+                <w:sz w:val="28"/>
+                <w:szCs w:val="28"/>
+                <w:lang w:val="en-US"/>
+              </w:rPr>
+              <w:t>Tìm kiếm</w:t>
+            </w:r>
+          </w:p>
+          <w:p>
+            <w:pPr>
+              <w:pStyle w:val="ListParagraph"/>
+              <w:numPr>
+                <w:ilvl w:val="0"/>
+                <w:numId w:val="9"/>
+              </w:numPr>
+              <w:spacing w:before="60" w:after="60"/>
+              <w:jc w:val="both"/>
+              <w:rPr>
+                <w:sz w:val="28"/>
+                <w:szCs w:val="28"/>
+                <w:lang w:val="vi-VN"/>
+              </w:rPr>
+            </w:pPr>
+            <w:r>
+              <w:rPr>
+                <w:sz w:val="28"/>
+                <w:szCs w:val="28"/>
+                <w:lang w:val="en-US"/>
+              </w:rPr>
+              <w:t>Đối tượng UI</w:t>
+            </w:r>
+          </w:p>
+          <w:p>
+            <w:pPr>
+              <w:pStyle w:val="ListParagraph"/>
+              <w:numPr>
+                <w:ilvl w:val="1"/>
+                <w:numId w:val="9"/>
+              </w:numPr>
+              <w:spacing w:before="60" w:after="60"/>
+              <w:ind w:hanging="357"/>
+              <w:jc w:val="both"/>
+              <w:rPr>
+                <w:sz w:val="28"/>
+                <w:szCs w:val="28"/>
+                <w:lang w:val="vi-VN"/>
+              </w:rPr>
+            </w:pPr>
+            <w:r>
+              <w:rPr>
+                <w:sz w:val="28"/>
+                <w:szCs w:val="28"/>
+                <w:lang w:val="vi-VN"/>
+              </w:rPr>
+              <w:t xml:space="preserve">Thêm </w:t>
+            </w:r>
+            <w:r>
+              <w:rPr>
+                <w:sz w:val="28"/>
+                <w:szCs w:val="28"/>
+                <w:lang w:val="en-US"/>
+              </w:rPr>
+              <w:t>đối tượng</w:t>
+            </w:r>
+          </w:p>
+          <w:p>
+            <w:pPr>
+              <w:pStyle w:val="ListParagraph"/>
+              <w:numPr>
+                <w:ilvl w:val="1"/>
+                <w:numId w:val="9"/>
+              </w:numPr>
+              <w:spacing w:before="60" w:after="60"/>
+              <w:jc w:val="both"/>
+              <w:rPr>
+                <w:sz w:val="28"/>
+                <w:szCs w:val="28"/>
+                <w:lang w:val="vi-VN"/>
+              </w:rPr>
+            </w:pPr>
+            <w:r>
+              <w:rPr>
+                <w:sz w:val="28"/>
+                <w:szCs w:val="28"/>
+                <w:lang w:val="vi-VN"/>
+              </w:rPr>
+              <w:t xml:space="preserve">Xóa </w:t>
+            </w:r>
+            <w:r>
+              <w:rPr>
+                <w:sz w:val="28"/>
+                <w:szCs w:val="28"/>
+                <w:lang w:val="en-US"/>
+              </w:rPr>
+              <w:t>đối tượng</w:t>
+            </w:r>
+          </w:p>
+          <w:p>
+            <w:pPr>
+              <w:pStyle w:val="ListParagraph"/>
+              <w:numPr>
+                <w:ilvl w:val="0"/>
+                <w:numId w:val="10"/>
+              </w:numPr>
+              <w:spacing w:before="60" w:after="60"/>
+              <w:ind w:hanging="357"/>
+              <w:jc w:val="both"/>
+              <w:rPr>
+                <w:sz w:val="28"/>
+                <w:szCs w:val="28"/>
+                <w:lang w:val="vi-VN"/>
+              </w:rPr>
+            </w:pPr>
+            <w:r>
+              <w:rPr>
+                <w:sz w:val="28"/>
+                <w:szCs w:val="28"/>
+                <w:lang w:val="en-US"/>
+              </w:rPr>
+              <w:t>Bộ dữ liệu</w:t>
+            </w:r>
+          </w:p>
+          <w:p>
+            <w:pPr>
+              <w:pStyle w:val="ListParagraph"/>
+              <w:numPr>
+                <w:ilvl w:val="1"/>
+                <w:numId w:val="9"/>
+              </w:numPr>
+              <w:spacing w:before="60" w:after="60"/>
+              <w:jc w:val="both"/>
+              <w:rPr>
+                <w:sz w:val="28"/>
+                <w:szCs w:val="28"/>
+                <w:lang w:val="vi-VN"/>
+              </w:rPr>
+            </w:pPr>
+            <w:r>
+              <w:rPr>
+                <w:sz w:val="28"/>
+                <w:szCs w:val="28"/>
+                <w:lang w:val="en-US"/>
+              </w:rPr>
+              <w:t>Tạo bộ dữ liệu</w:t>
+            </w:r>
+          </w:p>
+          <w:p>
+            <w:pPr>
+              <w:pStyle w:val="ListParagraph"/>
+              <w:numPr>
+                <w:ilvl w:val="1"/>
+                <w:numId w:val="9"/>
+              </w:numPr>
+              <w:spacing w:before="60" w:after="60"/>
+              <w:jc w:val="both"/>
+              <w:rPr>
+                <w:sz w:val="28"/>
+                <w:szCs w:val="28"/>
+                <w:lang w:val="vi-VN"/>
+              </w:rPr>
+            </w:pPr>
+            <w:r>
+              <w:rPr>
+                <w:sz w:val="28"/>
+                <w:szCs w:val="28"/>
+                <w:lang w:val="en-US"/>
+              </w:rPr>
+              <w:t>Xóa bộ dữ liệu</w:t>
+            </w:r>
+          </w:p>
+          <w:p>
+            <w:pPr>
+              <w:pStyle w:val="ListParagraph"/>
+              <w:numPr>
+                <w:ilvl w:val="0"/>
+                <w:numId w:val="10"/>
+              </w:numPr>
+              <w:spacing w:before="60" w:after="60"/>
+              <w:ind w:hanging="357"/>
+              <w:jc w:val="both"/>
+              <w:rPr>
+                <w:sz w:val="28"/>
+                <w:szCs w:val="28"/>
+                <w:lang w:val="vi-VN"/>
+              </w:rPr>
+            </w:pPr>
+            <w:r>
+              <w:rPr>
+                <w:sz w:val="28"/>
+                <w:szCs w:val="28"/>
+                <w:lang w:val="en-US"/>
+              </w:rPr>
+              <w:t>Báo cáo</w:t>
+            </w:r>
+          </w:p>
+          <w:p>
+            <w:pPr>
+              <w:pStyle w:val="ListParagraph"/>
+              <w:numPr>
+                <w:ilvl w:val="1"/>
+                <w:numId w:val="9"/>
+              </w:numPr>
+              <w:spacing w:before="60" w:after="60"/>
+              <w:jc w:val="both"/>
+              <w:rPr>
+                <w:sz w:val="28"/>
+                <w:szCs w:val="28"/>
+                <w:lang w:val="vi-VN"/>
+              </w:rPr>
+            </w:pPr>
+            <w:r>
+              <w:rPr>
+                <w:sz w:val="28"/>
+                <w:szCs w:val="28"/>
+                <w:lang w:val="en-US"/>
+              </w:rPr>
+              <w:t>Tìm kiếm</w:t>
+            </w:r>
+          </w:p>
+          <w:p>
+            <w:pPr>
+              <w:pStyle w:val="ListParagraph"/>
+              <w:numPr>
+                <w:ilvl w:val="1"/>
+                <w:numId w:val="9"/>
+              </w:numPr>
+              <w:spacing w:before="60" w:after="60"/>
+              <w:jc w:val="both"/>
+              <w:rPr>
+                <w:sz w:val="28"/>
+                <w:szCs w:val="28"/>
+                <w:lang w:val="vi-VN"/>
+              </w:rPr>
+            </w:pPr>
+            <w:r>
+              <w:rPr>
+                <w:sz w:val="28"/>
+                <w:szCs w:val="28"/>
+                <w:lang w:val="en-US"/>
+              </w:rPr>
+              <w:t>Tải PDF</w:t>
+            </w:r>
+          </w:p>
+          <w:p>
+            <w:pPr>
+              <w:pStyle w:val="ListParagraph"/>
+              <w:numPr>
+                <w:ilvl w:val="1"/>
+                <w:numId w:val="9"/>
+              </w:numPr>
+              <w:spacing w:before="60" w:after="60"/>
+              <w:jc w:val="both"/>
+              <w:rPr>
+                <w:sz w:val="28"/>
+                <w:szCs w:val="28"/>
+                <w:lang w:val="vi-VN"/>
+              </w:rPr>
+            </w:pPr>
+            <w:r>
+              <w:rPr>
+                <w:sz w:val="28"/>
+                <w:szCs w:val="28"/>
+                <w:lang w:val="en-US"/>
+              </w:rPr>
+              <w:t>Chi tiết</w:t>
+            </w:r>
+          </w:p>
+          <w:p>
+            <w:pPr>
+              <w:pStyle w:val="ListParagraph"/>
+              <w:numPr>
+                <w:ilvl w:val="0"/>
+                <w:numId w:val="10"/>
+              </w:numPr>
+              <w:spacing w:before="60" w:after="60"/>
+              <w:ind w:hanging="357"/>
+              <w:jc w:val="both"/>
+              <w:rPr>
+                <w:sz w:val="28"/>
+                <w:szCs w:val="28"/>
+                <w:lang w:val="vi-VN"/>
+              </w:rPr>
+            </w:pPr>
+            <w:r>
+              <w:rPr>
+                <w:sz w:val="28"/>
+                <w:szCs w:val="28"/>
+                <w:lang w:val="en-US"/>
+              </w:rPr>
+              <w:t>Tài khoản</w:t>
+            </w:r>
+          </w:p>
+          <w:p>
+            <w:pPr>
+              <w:pStyle w:val="ListParagraph"/>
+              <w:numPr>
+                <w:ilvl w:val="1"/>
+                <w:numId w:val="9"/>
+              </w:numPr>
+              <w:spacing w:before="60" w:after="60"/>
+              <w:jc w:val="both"/>
+              <w:rPr>
+                <w:sz w:val="28"/>
+                <w:szCs w:val="28"/>
+                <w:lang w:val="vi-VN"/>
+              </w:rPr>
+            </w:pPr>
+            <w:r>
+              <w:rPr>
+                <w:sz w:val="28"/>
+                <w:szCs w:val="28"/>
+                <w:lang w:val="en-US"/>
+              </w:rPr>
+              <w:t>Đổi mật khẩu</w:t>
+            </w:r>
+          </w:p>
+        </w:tc>
+      </w:tr>
+    </w:tbl>
+    <w:p/>
     <w:sectPr>
       <w:pgSz w:w="11907" w:h="16840"/>
       <w:pgMar w:top="899" w:right="1418" w:bottom="720" w:left="1418" w:header="720" w:footer="720" w:gutter="0"/>
@@ -2448,6 +4394,119 @@
     </w:lvl>
   </w:abstractNum>
   <w:abstractNum w:abstractNumId="3" w15:restartNumberingAfterBreak="0">
+    <w:nsid w:val="2F7F455D"/>
+    <w:multiLevelType w:val="hybridMultilevel"/>
+    <w:tmpl w:val="EDB833A8"/>
+    <w:lvl w:ilvl="0" w:tplc="0409000B">
+      <w:start w:val="1"/>
+      <w:numFmt w:val="bullet"/>
+      <w:lvlText w:val=""/>
+      <w:lvlJc w:val="left"/>
+      <w:pPr>
+        <w:ind w:left="720" w:hanging="360"/>
+      </w:pPr>
+      <w:rPr>
+        <w:rFonts w:ascii="Wingdings" w:hAnsi="Wingdings" w:hint="default"/>
+      </w:rPr>
+    </w:lvl>
+    <w:lvl w:ilvl="1" w:tplc="04090003" w:tentative="1">
+      <w:start w:val="1"/>
+      <w:numFmt w:val="bullet"/>
+      <w:lvlText w:val="o"/>
+      <w:lvlJc w:val="left"/>
+      <w:pPr>
+        <w:ind w:left="1440" w:hanging="360"/>
+      </w:pPr>
+      <w:rPr>
+        <w:rFonts w:ascii="Courier New" w:hAnsi="Courier New" w:cs="Courier New" w:hint="default"/>
+      </w:rPr>
+    </w:lvl>
+    <w:lvl w:ilvl="2" w:tplc="04090005" w:tentative="1">
+      <w:start w:val="1"/>
+      <w:numFmt w:val="bullet"/>
+      <w:lvlText w:val=""/>
+      <w:lvlJc w:val="left"/>
+      <w:pPr>
+        <w:ind w:left="2160" w:hanging="360"/>
+      </w:pPr>
+      <w:rPr>
+        <w:rFonts w:ascii="Wingdings" w:hAnsi="Wingdings" w:hint="default"/>
+      </w:rPr>
+    </w:lvl>
+    <w:lvl w:ilvl="3" w:tplc="04090001" w:tentative="1">
+      <w:start w:val="1"/>
+      <w:numFmt w:val="bullet"/>
+      <w:lvlText w:val=""/>
+      <w:lvlJc w:val="left"/>
+      <w:pPr>
+        <w:ind w:left="2880" w:hanging="360"/>
+      </w:pPr>
+      <w:rPr>
+        <w:rFonts w:ascii="Symbol" w:hAnsi="Symbol" w:hint="default"/>
+      </w:rPr>
+    </w:lvl>
+    <w:lvl w:ilvl="4" w:tplc="04090003" w:tentative="1">
+      <w:start w:val="1"/>
+      <w:numFmt w:val="bullet"/>
+      <w:lvlText w:val="o"/>
+      <w:lvlJc w:val="left"/>
+      <w:pPr>
+        <w:ind w:left="3600" w:hanging="360"/>
+      </w:pPr>
+      <w:rPr>
+        <w:rFonts w:ascii="Courier New" w:hAnsi="Courier New" w:cs="Courier New" w:hint="default"/>
+      </w:rPr>
+    </w:lvl>
+    <w:lvl w:ilvl="5" w:tplc="04090005" w:tentative="1">
+      <w:start w:val="1"/>
+      <w:numFmt w:val="bullet"/>
+      <w:lvlText w:val=""/>
+      <w:lvlJc w:val="left"/>
+      <w:pPr>
+        <w:ind w:left="4320" w:hanging="360"/>
+      </w:pPr>
+      <w:rPr>
+        <w:rFonts w:ascii="Wingdings" w:hAnsi="Wingdings" w:hint="default"/>
+      </w:rPr>
+    </w:lvl>
+    <w:lvl w:ilvl="6" w:tplc="04090001" w:tentative="1">
+      <w:start w:val="1"/>
+      <w:numFmt w:val="bullet"/>
+      <w:lvlText w:val=""/>
+      <w:lvlJc w:val="left"/>
+      <w:pPr>
+        <w:ind w:left="5040" w:hanging="360"/>
+      </w:pPr>
+      <w:rPr>
+        <w:rFonts w:ascii="Symbol" w:hAnsi="Symbol" w:hint="default"/>
+      </w:rPr>
+    </w:lvl>
+    <w:lvl w:ilvl="7" w:tplc="04090003" w:tentative="1">
+      <w:start w:val="1"/>
+      <w:numFmt w:val="bullet"/>
+      <w:lvlText w:val="o"/>
+      <w:lvlJc w:val="left"/>
+      <w:pPr>
+        <w:ind w:left="5760" w:hanging="360"/>
+      </w:pPr>
+      <w:rPr>
+        <w:rFonts w:ascii="Courier New" w:hAnsi="Courier New" w:cs="Courier New" w:hint="default"/>
+      </w:rPr>
+    </w:lvl>
+    <w:lvl w:ilvl="8" w:tplc="04090005" w:tentative="1">
+      <w:start w:val="1"/>
+      <w:numFmt w:val="bullet"/>
+      <w:lvlText w:val=""/>
+      <w:lvlJc w:val="left"/>
+      <w:pPr>
+        <w:ind w:left="6480" w:hanging="360"/>
+      </w:pPr>
+      <w:rPr>
+        <w:rFonts w:ascii="Wingdings" w:hAnsi="Wingdings" w:hint="default"/>
+      </w:rPr>
+    </w:lvl>
+  </w:abstractNum>
+  <w:abstractNum w:abstractNumId="4" w15:restartNumberingAfterBreak="0">
     <w:nsid w:val="305860D5"/>
     <w:multiLevelType w:val="multilevel"/>
     <w:tmpl w:val="0AEECBF6"/>
@@ -2596,7 +4655,7 @@
       </w:rPr>
     </w:lvl>
   </w:abstractNum>
-  <w:abstractNum w:abstractNumId="4" w15:restartNumberingAfterBreak="0">
+  <w:abstractNum w:abstractNumId="5" w15:restartNumberingAfterBreak="0">
     <w:nsid w:val="3F7E7620"/>
     <w:multiLevelType w:val="multilevel"/>
     <w:tmpl w:val="07F8F92C"/>
@@ -2709,7 +4768,7 @@
       </w:rPr>
     </w:lvl>
   </w:abstractNum>
-  <w:abstractNum w:abstractNumId="5" w15:restartNumberingAfterBreak="0">
+  <w:abstractNum w:abstractNumId="6" w15:restartNumberingAfterBreak="0">
     <w:nsid w:val="3F932D8B"/>
     <w:multiLevelType w:val="multilevel"/>
     <w:tmpl w:val="CEA05028"/>
@@ -2822,7 +4881,7 @@
       </w:rPr>
     </w:lvl>
   </w:abstractNum>
-  <w:abstractNum w:abstractNumId="6" w15:restartNumberingAfterBreak="0">
+  <w:abstractNum w:abstractNumId="7" w15:restartNumberingAfterBreak="0">
     <w:nsid w:val="6D89720C"/>
     <w:multiLevelType w:val="multilevel"/>
     <w:tmpl w:val="EC9E0DAA"/>
@@ -2971,7 +5030,120 @@
       </w:rPr>
     </w:lvl>
   </w:abstractNum>
-  <w:abstractNum w:abstractNumId="7" w15:restartNumberingAfterBreak="0">
+  <w:abstractNum w:abstractNumId="8" w15:restartNumberingAfterBreak="0">
+    <w:nsid w:val="78A92E7B"/>
+    <w:multiLevelType w:val="hybridMultilevel"/>
+    <w:tmpl w:val="120E24BA"/>
+    <w:lvl w:ilvl="0" w:tplc="0409000B">
+      <w:start w:val="1"/>
+      <w:numFmt w:val="bullet"/>
+      <w:lvlText w:val=""/>
+      <w:lvlJc w:val="left"/>
+      <w:pPr>
+        <w:ind w:left="720" w:hanging="360"/>
+      </w:pPr>
+      <w:rPr>
+        <w:rFonts w:ascii="Wingdings" w:hAnsi="Wingdings" w:hint="default"/>
+      </w:rPr>
+    </w:lvl>
+    <w:lvl w:ilvl="1" w:tplc="04090005">
+      <w:start w:val="1"/>
+      <w:numFmt w:val="bullet"/>
+      <w:lvlText w:val=""/>
+      <w:lvlJc w:val="left"/>
+      <w:pPr>
+        <w:ind w:left="1440" w:hanging="360"/>
+      </w:pPr>
+      <w:rPr>
+        <w:rFonts w:ascii="Wingdings" w:hAnsi="Wingdings" w:hint="default"/>
+      </w:rPr>
+    </w:lvl>
+    <w:lvl w:ilvl="2" w:tplc="04090005">
+      <w:start w:val="1"/>
+      <w:numFmt w:val="bullet"/>
+      <w:lvlText w:val=""/>
+      <w:lvlJc w:val="left"/>
+      <w:pPr>
+        <w:ind w:left="2160" w:hanging="360"/>
+      </w:pPr>
+      <w:rPr>
+        <w:rFonts w:ascii="Wingdings" w:hAnsi="Wingdings" w:hint="default"/>
+      </w:rPr>
+    </w:lvl>
+    <w:lvl w:ilvl="3" w:tplc="04090001" w:tentative="1">
+      <w:start w:val="1"/>
+      <w:numFmt w:val="bullet"/>
+      <w:lvlText w:val=""/>
+      <w:lvlJc w:val="left"/>
+      <w:pPr>
+        <w:ind w:left="2880" w:hanging="360"/>
+      </w:pPr>
+      <w:rPr>
+        <w:rFonts w:ascii="Symbol" w:hAnsi="Symbol" w:hint="default"/>
+      </w:rPr>
+    </w:lvl>
+    <w:lvl w:ilvl="4" w:tplc="04090003" w:tentative="1">
+      <w:start w:val="1"/>
+      <w:numFmt w:val="bullet"/>
+      <w:lvlText w:val="o"/>
+      <w:lvlJc w:val="left"/>
+      <w:pPr>
+        <w:ind w:left="3600" w:hanging="360"/>
+      </w:pPr>
+      <w:rPr>
+        <w:rFonts w:ascii="Courier New" w:hAnsi="Courier New" w:cs="Courier New" w:hint="default"/>
+      </w:rPr>
+    </w:lvl>
+    <w:lvl w:ilvl="5" w:tplc="04090005" w:tentative="1">
+      <w:start w:val="1"/>
+      <w:numFmt w:val="bullet"/>
+      <w:lvlText w:val=""/>
+      <w:lvlJc w:val="left"/>
+      <w:pPr>
+        <w:ind w:left="4320" w:hanging="360"/>
+      </w:pPr>
+      <w:rPr>
+        <w:rFonts w:ascii="Wingdings" w:hAnsi="Wingdings" w:hint="default"/>
+      </w:rPr>
+    </w:lvl>
+    <w:lvl w:ilvl="6" w:tplc="04090001" w:tentative="1">
+      <w:start w:val="1"/>
+      <w:numFmt w:val="bullet"/>
+      <w:lvlText w:val=""/>
+      <w:lvlJc w:val="left"/>
+      <w:pPr>
+        <w:ind w:left="5040" w:hanging="360"/>
+      </w:pPr>
+      <w:rPr>
+        <w:rFonts w:ascii="Symbol" w:hAnsi="Symbol" w:hint="default"/>
+      </w:rPr>
+    </w:lvl>
+    <w:lvl w:ilvl="7" w:tplc="04090003" w:tentative="1">
+      <w:start w:val="1"/>
+      <w:numFmt w:val="bullet"/>
+      <w:lvlText w:val="o"/>
+      <w:lvlJc w:val="left"/>
+      <w:pPr>
+        <w:ind w:left="5760" w:hanging="360"/>
+      </w:pPr>
+      <w:rPr>
+        <w:rFonts w:ascii="Courier New" w:hAnsi="Courier New" w:cs="Courier New" w:hint="default"/>
+      </w:rPr>
+    </w:lvl>
+    <w:lvl w:ilvl="8" w:tplc="04090005" w:tentative="1">
+      <w:start w:val="1"/>
+      <w:numFmt w:val="bullet"/>
+      <w:lvlText w:val=""/>
+      <w:lvlJc w:val="left"/>
+      <w:pPr>
+        <w:ind w:left="6480" w:hanging="360"/>
+      </w:pPr>
+      <w:rPr>
+        <w:rFonts w:ascii="Wingdings" w:hAnsi="Wingdings" w:hint="default"/>
+      </w:rPr>
+    </w:lvl>
+  </w:abstractNum>
+  <w:abstractNum w:abstractNumId="9" w15:restartNumberingAfterBreak="0">
     <w:nsid w:val="78AA5D03"/>
     <w:multiLevelType w:val="multilevel"/>
     <w:tmpl w:val="F54AAC9C"/>
@@ -3057,17 +5229,130 @@
       </w:pPr>
     </w:lvl>
   </w:abstractNum>
+  <w:abstractNum w:abstractNumId="10" w15:restartNumberingAfterBreak="0">
+    <w:nsid w:val="7EDC00D9"/>
+    <w:multiLevelType w:val="multilevel"/>
+    <w:tmpl w:val="E58CA9BE"/>
+    <w:lvl w:ilvl="0">
+      <w:start w:val="1"/>
+      <w:numFmt w:val="bullet"/>
+      <w:lvlText w:val=""/>
+      <w:lvlJc w:val="left"/>
+      <w:pPr>
+        <w:ind w:left="720" w:hanging="360"/>
+      </w:pPr>
+      <w:rPr>
+        <w:rFonts w:ascii="Wingdings" w:hAnsi="Wingdings" w:hint="default"/>
+      </w:rPr>
+    </w:lvl>
+    <w:lvl w:ilvl="1">
+      <w:start w:val="1"/>
+      <w:numFmt w:val="bullet"/>
+      <w:lvlText w:val=""/>
+      <w:lvlJc w:val="left"/>
+      <w:pPr>
+        <w:ind w:left="1440" w:hanging="360"/>
+      </w:pPr>
+      <w:rPr>
+        <w:rFonts w:ascii="Wingdings" w:hAnsi="Wingdings" w:hint="default"/>
+      </w:rPr>
+    </w:lvl>
+    <w:lvl w:ilvl="2">
+      <w:start w:val="1"/>
+      <w:numFmt w:val="bullet"/>
+      <w:lvlText w:val=""/>
+      <w:lvlJc w:val="left"/>
+      <w:pPr>
+        <w:ind w:left="2160" w:hanging="360"/>
+      </w:pPr>
+      <w:rPr>
+        <w:rFonts w:ascii="Wingdings" w:hAnsi="Wingdings" w:hint="default"/>
+      </w:rPr>
+    </w:lvl>
+    <w:lvl w:ilvl="3">
+      <w:start w:val="1"/>
+      <w:numFmt w:val="bullet"/>
+      <w:lvlText w:val=""/>
+      <w:lvlJc w:val="left"/>
+      <w:pPr>
+        <w:ind w:left="2880" w:hanging="360"/>
+      </w:pPr>
+      <w:rPr>
+        <w:rFonts w:ascii="Symbol" w:hAnsi="Symbol" w:hint="default"/>
+      </w:rPr>
+    </w:lvl>
+    <w:lvl w:ilvl="4">
+      <w:start w:val="1"/>
+      <w:numFmt w:val="bullet"/>
+      <w:lvlText w:val="o"/>
+      <w:lvlJc w:val="left"/>
+      <w:pPr>
+        <w:ind w:left="3600" w:hanging="360"/>
+      </w:pPr>
+      <w:rPr>
+        <w:rFonts w:ascii="Courier New" w:hAnsi="Courier New" w:cs="Courier New" w:hint="default"/>
+      </w:rPr>
+    </w:lvl>
+    <w:lvl w:ilvl="5">
+      <w:start w:val="1"/>
+      <w:numFmt w:val="bullet"/>
+      <w:lvlText w:val=""/>
+      <w:lvlJc w:val="left"/>
+      <w:pPr>
+        <w:ind w:left="4320" w:hanging="360"/>
+      </w:pPr>
+      <w:rPr>
+        <w:rFonts w:ascii="Wingdings" w:hAnsi="Wingdings" w:hint="default"/>
+      </w:rPr>
+    </w:lvl>
+    <w:lvl w:ilvl="6">
+      <w:start w:val="1"/>
+      <w:numFmt w:val="bullet"/>
+      <w:lvlText w:val=""/>
+      <w:lvlJc w:val="left"/>
+      <w:pPr>
+        <w:ind w:left="5040" w:hanging="360"/>
+      </w:pPr>
+      <w:rPr>
+        <w:rFonts w:ascii="Symbol" w:hAnsi="Symbol" w:hint="default"/>
+      </w:rPr>
+    </w:lvl>
+    <w:lvl w:ilvl="7">
+      <w:start w:val="1"/>
+      <w:numFmt w:val="bullet"/>
+      <w:lvlText w:val="o"/>
+      <w:lvlJc w:val="left"/>
+      <w:pPr>
+        <w:ind w:left="5760" w:hanging="360"/>
+      </w:pPr>
+      <w:rPr>
+        <w:rFonts w:ascii="Courier New" w:hAnsi="Courier New" w:cs="Courier New" w:hint="default"/>
+      </w:rPr>
+    </w:lvl>
+    <w:lvl w:ilvl="8">
+      <w:start w:val="1"/>
+      <w:numFmt w:val="bullet"/>
+      <w:lvlText w:val=""/>
+      <w:lvlJc w:val="left"/>
+      <w:pPr>
+        <w:ind w:left="6480" w:hanging="360"/>
+      </w:pPr>
+      <w:rPr>
+        <w:rFonts w:ascii="Wingdings" w:hAnsi="Wingdings" w:hint="default"/>
+      </w:rPr>
+    </w:lvl>
+  </w:abstractNum>
   <w:num w:numId="1">
-    <w:abstractNumId w:val="7"/>
+    <w:abstractNumId w:val="9"/>
   </w:num>
   <w:num w:numId="2">
+    <w:abstractNumId w:val="6"/>
+  </w:num>
+  <w:num w:numId="3">
     <w:abstractNumId w:val="5"/>
   </w:num>
-  <w:num w:numId="3">
+  <w:num w:numId="4">
     <w:abstractNumId w:val="4"/>
-  </w:num>
-  <w:num w:numId="4">
-    <w:abstractNumId w:val="3"/>
   </w:num>
   <w:num w:numId="5">
     <w:abstractNumId w:val="2"/>
@@ -3076,10 +5361,19 @@
     <w:abstractNumId w:val="0"/>
   </w:num>
   <w:num w:numId="7">
-    <w:abstractNumId w:val="6"/>
+    <w:abstractNumId w:val="7"/>
   </w:num>
   <w:num w:numId="8">
     <w:abstractNumId w:val="1"/>
+  </w:num>
+  <w:num w:numId="9">
+    <w:abstractNumId w:val="10"/>
+  </w:num>
+  <w:num w:numId="10">
+    <w:abstractNumId w:val="3"/>
+  </w:num>
+  <w:num w:numId="11">
+    <w:abstractNumId w:val="8"/>
   </w:num>
 </w:numbering>
 </file>
@@ -3256,7 +5550,7 @@
     <w:lsdException w:name="Table Web 2" w:semiHidden="1" w:unhideWhenUsed="1"/>
     <w:lsdException w:name="Table Web 3" w:semiHidden="1" w:unhideWhenUsed="1"/>
     <w:lsdException w:name="Balloon Text" w:semiHidden="1" w:unhideWhenUsed="1"/>
-    <w:lsdException w:name="Table Grid" w:uiPriority="39"/>
+    <w:lsdException w:name="Table Grid" w:uiPriority="39" w:qFormat="1"/>
     <w:lsdException w:name="Table Theme" w:semiHidden="1" w:unhideWhenUsed="1"/>
     <w:lsdException w:name="Placeholder Text" w:semiHidden="1"/>
     <w:lsdException w:name="No Spacing" w:uiPriority="1" w:qFormat="1"/>
@@ -3723,6 +6017,58 @@
       <w:szCs w:val="28"/>
     </w:rPr>
   </w:style>
+  <w:style w:type="table" w:styleId="TableGrid">
+    <w:name w:val="Table Grid"/>
+    <w:basedOn w:val="TableNormal"/>
+    <w:uiPriority w:val="39"/>
+    <w:qFormat/>
+    <w:rsid w:val="00A94213"/>
+    <w:pPr>
+      <w:spacing w:before="40" w:line="276" w:lineRule="auto"/>
+      <w:ind w:firstLine="0"/>
+    </w:pPr>
+    <w:rPr>
+      <w:rFonts w:eastAsia="SimSun"/>
+      <w:sz w:val="22"/>
+      <w:szCs w:val="22"/>
+      <w:lang w:val="vi-VN" w:eastAsia="en-US"/>
+    </w:rPr>
+    <w:tblPr>
+      <w:tblBorders>
+        <w:top w:val="single" w:sz="4" w:space="0" w:color="auto"/>
+        <w:left w:val="single" w:sz="4" w:space="0" w:color="auto"/>
+        <w:bottom w:val="single" w:sz="4" w:space="0" w:color="auto"/>
+        <w:right w:val="single" w:sz="4" w:space="0" w:color="auto"/>
+        <w:insideH w:val="single" w:sz="4" w:space="0" w:color="auto"/>
+        <w:insideV w:val="single" w:sz="4" w:space="0" w:color="auto"/>
+      </w:tblBorders>
+    </w:tblPr>
+  </w:style>
+  <w:style w:type="paragraph" w:styleId="ListParagraph">
+    <w:name w:val="List Paragraph"/>
+    <w:basedOn w:val="Normal"/>
+    <w:link w:val="ListParagraphChar"/>
+    <w:uiPriority w:val="34"/>
+    <w:qFormat/>
+    <w:rsid w:val="00A94213"/>
+    <w:pPr>
+      <w:ind w:left="720" w:firstLine="0"/>
+      <w:contextualSpacing/>
+    </w:pPr>
+    <w:rPr>
+      <w:lang w:val="zh-CN" w:eastAsia="zh-CN"/>
+    </w:rPr>
+  </w:style>
+  <w:style w:type="character" w:customStyle="1" w:styleId="ListParagraphChar">
+    <w:name w:val="List Paragraph Char"/>
+    <w:link w:val="ListParagraph"/>
+    <w:uiPriority w:val="34"/>
+    <w:qFormat/>
+    <w:rsid w:val="00A94213"/>
+    <w:rPr>
+      <w:lang w:val="zh-CN" w:eastAsia="zh-CN"/>
+    </w:rPr>
+  </w:style>
 </w:styles>
 </file>
 

</xml_diff>